<commit_message>
Artisan card now have automatic location fetching and rating stars
</commit_message>
<xml_diff>
--- a/Services_implemented.docx
+++ b/Services_implemented.docx
@@ -84,17 +84,15 @@
         </w:rPr>
         <w:t>Admin can verify/</w:t>
       </w:r>
-      <w:proofErr w:type="spellStart"/>
-      <w:r>
-        <w:rPr>
-          <w:rFonts w:ascii="Segoe UI" w:eastAsia="Times New Roman" w:hAnsi="Segoe UI" w:cs="Segoe UI"/>
-          <w:color w:val="404040"/>
-          <w:sz w:val="24"/>
-          <w:szCs w:val="24"/>
-        </w:rPr>
-        <w:t>unverify</w:t>
-      </w:r>
-      <w:proofErr w:type="spellEnd"/>
+      <w:r>
+        <w:rPr>
+          <w:rFonts w:ascii="Segoe UI" w:eastAsia="Times New Roman" w:hAnsi="Segoe UI" w:cs="Segoe UI"/>
+          <w:color w:val="404040"/>
+          <w:sz w:val="24"/>
+          <w:szCs w:val="24"/>
+        </w:rPr>
+        <w:t>unverified</w:t>
+      </w:r>
       <w:r>
         <w:rPr>
           <w:rFonts w:ascii="Segoe UI" w:eastAsia="Times New Roman" w:hAnsi="Segoe UI" w:cs="Segoe UI"/>
@@ -1081,7 +1079,6 @@
         </w:rPr>
         <w:t>Consider using Django's </w:t>
       </w:r>
-      <w:proofErr w:type="spellStart"/>
       <w:r>
         <w:rPr>
           <w:rFonts w:ascii="Courier New" w:eastAsia="Times New Roman" w:hAnsi="Courier New" w:cs="Courier New"/>
@@ -1090,9 +1087,8 @@
           <w:szCs w:val="21"/>
           <w:shd w:val="clear" w:color="auto" w:fill="ECECEC"/>
         </w:rPr>
-        <w:t>select_related</w:t>
-      </w:r>
-      <w:proofErr w:type="spellEnd"/>
+        <w:t>select related</w:t>
+      </w:r>
       <w:r>
         <w:rPr>
           <w:rFonts w:ascii="Segoe UI" w:eastAsia="Times New Roman" w:hAnsi="Segoe UI" w:cs="Segoe UI"/>
@@ -1102,7 +1098,6 @@
         </w:rPr>
         <w:t> and </w:t>
       </w:r>
-      <w:proofErr w:type="spellStart"/>
       <w:r>
         <w:rPr>
           <w:rFonts w:ascii="Courier New" w:eastAsia="Times New Roman" w:hAnsi="Courier New" w:cs="Courier New"/>
@@ -1111,9 +1106,8 @@
           <w:szCs w:val="21"/>
           <w:shd w:val="clear" w:color="auto" w:fill="ECECEC"/>
         </w:rPr>
-        <w:t>prefetch_related</w:t>
-      </w:r>
-      <w:proofErr w:type="spellEnd"/>
+        <w:t>prefetch related</w:t>
+      </w:r>
       <w:r>
         <w:rPr>
           <w:rFonts w:ascii="Segoe UI" w:eastAsia="Times New Roman" w:hAnsi="Segoe UI" w:cs="Segoe UI"/>

</xml_diff>